<commit_message>
Retrain MLP on improved synthetic generator (v1.1.0-synth); verify end-to-end
- ai-service/train_models_v2.py: richer latent structure (ability/effort/risk),
  6k rows; honesty guards (warn R2>0.97, fail if below baseline).
- Real measured improvement (validation): R2 0.6709->0.7573, MAE 5.81->5.07,
  RMSE 7.19->6.32, risk F1 0.8211->0.8598; beats both baselines; no leakage.
  LSTM unchanged (val RMSE 0.24971).
- Verified live through Java->AI: POST /api/ai/predict/{id} returns
  modelVersion 1.1.0-synth; low performer -> score 29.79 at_risk=true,
  high performer -> score 100.0 at_risk=false.
- Re-ran suites: smoke 23/23, verify-ai 19/19, pytest 14/14.
- Updated QA log, MIS report and rebuilt report/deck with v2 metrics.
</commit_message>
<xml_diff>
--- a/docs/USAMIS_Engineering_Report.docx
+++ b/docs/USAMIS_Engineering_Report.docx
@@ -4019,7 +4019,7 @@
               <w:rPr>
                 <w:sz w:val="20"/>
               </w:rPr>
-              <w:t>5.8126</w:t>
+              <w:t>5.0688</w:t>
             </w:r>
           </w:p>
         </w:tc>
@@ -4076,7 +4076,7 @@
               <w:rPr>
                 <w:sz w:val="20"/>
               </w:rPr>
-              <w:t>7.1903</w:t>
+              <w:t>6.3194</w:t>
             </w:r>
           </w:p>
         </w:tc>
@@ -4133,7 +4133,7 @@
               <w:rPr>
                 <w:sz w:val="20"/>
               </w:rPr>
-              <w:t>0.6709</w:t>
+              <w:t>0.7573</w:t>
             </w:r>
           </w:p>
         </w:tc>
@@ -4190,7 +4190,7 @@
               <w:rPr>
                 <w:sz w:val="20"/>
               </w:rPr>
-              <w:t>0.7741</w:t>
+              <w:t>0.8185</w:t>
             </w:r>
           </w:p>
         </w:tc>
@@ -4247,7 +4247,7 @@
               <w:rPr>
                 <w:sz w:val="20"/>
               </w:rPr>
-              <w:t>0.8741</w:t>
+              <w:t>0.9055</w:t>
             </w:r>
           </w:p>
         </w:tc>
@@ -4304,7 +4304,7 @@
               <w:rPr>
                 <w:sz w:val="20"/>
               </w:rPr>
-              <w:t>0.8211</w:t>
+              <w:t>0.8598</w:t>
             </w:r>
           </w:p>
         </w:tc>
@@ -4361,7 +4361,7 @@
               <w:rPr>
                 <w:sz w:val="20"/>
               </w:rPr>
-              <w:t>299 / 640</w:t>
+              <w:t>299 / 960</w:t>
             </w:r>
           </w:p>
         </w:tc>

</xml_diff>